<commit_message>
docs: ghi chú mã nguồn cho từng thành phần trong báo cáo
</commit_message>
<xml_diff>
--- a/docs/Bai-4-Ran-san-moi-Bao-cao-cach-lam.docx
+++ b/docs/Bai-4-Ran-san-moi-Bao-cao-cach-lam.docx
@@ -383,6 +383,31 @@
     </w:p>
     <w:p>
       <w:pPr>
+        <w:spacing w:after="140"/>
+      </w:pPr>
+      <w:r>
+        <w:rPr>
+          <w:rFonts w:ascii="Times New Roman" w:cs="Times New Roman" w:eastAsia="Times New Roman" w:hAnsi="Times New Roman"/>
+          <w:b/>
+          <w:bCs/>
+          <w:color w:val="666666"/>
+          <w:sz w:val="20"/>
+          <w:szCs w:val="20"/>
+        </w:rPr>
+        <w:t xml:space="preserve">Mã nguồn: </w:t>
+      </w:r>
+      <w:r>
+        <w:rPr>
+          <w:rFonts w:ascii="Consolas" w:cs="Consolas" w:eastAsia="Consolas" w:hAnsi="Consolas"/>
+          <w:color w:val="555555"/>
+          <w:sz w:val="19"/>
+          <w:szCs w:val="19"/>
+        </w:rPr>
+        <w:t xml:space="preserve">snake.py · dòng 131–139 (update) · 142–145 (step).</w:t>
+      </w:r>
+    </w:p>
+    <w:p>
+      <w:pPr>
         <w:pStyle w:val="Heading2"/>
       </w:pPr>
       <w:r>
@@ -1101,6 +1126,31 @@
     </w:tbl>
     <w:p>
       <w:pPr>
+        <w:spacing w:after="140"/>
+      </w:pPr>
+      <w:r>
+        <w:rPr>
+          <w:rFonts w:ascii="Times New Roman" w:cs="Times New Roman" w:eastAsia="Times New Roman" w:hAnsi="Times New Roman"/>
+          <w:b/>
+          <w:bCs/>
+          <w:color w:val="666666"/>
+          <w:sz w:val="20"/>
+          <w:szCs w:val="20"/>
+        </w:rPr>
+        <w:t xml:space="preserve">Mã nguồn: </w:t>
+      </w:r>
+      <w:r>
+        <w:rPr>
+          <w:rFonts w:ascii="Consolas" w:cs="Consolas" w:eastAsia="Consolas" w:hAnsi="Consolas"/>
+          <w:color w:val="555555"/>
+          <w:sz w:val="19"/>
+          <w:szCs w:val="19"/>
+        </w:rPr>
+        <w:t xml:space="preserve">snake.py · dòng 24–37 — khối hằng số cấu hình; dòng 39–45 — bảng DIRS.</w:t>
+      </w:r>
+    </w:p>
+    <w:p>
+      <w:pPr>
         <w:pStyle w:val="Heading1"/>
       </w:pPr>
       <w:r>
@@ -1108,6 +1158,24 @@
           <w:rFonts w:ascii="Times New Roman" w:cs="Times New Roman" w:eastAsia="Times New Roman" w:hAnsi="Times New Roman"/>
         </w:rPr>
         <w:t xml:space="preserve">3. Các thành phần chính</w:t>
+      </w:r>
+    </w:p>
+    <w:p>
+      <w:pPr>
+        <w:spacing w:after="120" w:line="300"/>
+        <w:jc w:val="both"/>
+      </w:pPr>
+      <w:r>
+        <w:rPr>
+          <w:rFonts w:ascii="Times New Roman" w:cs="Times New Roman" w:eastAsia="Times New Roman" w:hAnsi="Times New Roman"/>
+          <w:b w:val="false"/>
+          <w:bCs w:val="false"/>
+          <w:i w:val="false"/>
+          <w:iCs w:val="false"/>
+          <w:sz w:val="24"/>
+          <w:szCs w:val="24"/>
+        </w:rPr>
+        <w:t xml:space="preserve">Số dòng ghi theo phiên bản snake.py hiện tại; nếu code thay đổi, tên hàm vẫn là mốc chính.</w:t>
       </w:r>
     </w:p>
     <w:p>
@@ -1152,13 +1220,14 @@
         </w:tblBorders>
       </w:tblPr>
       <w:tblGrid>
-        <w:gridCol w:w="2600"/>
-        <w:gridCol w:w="6426"/>
+        <w:gridCol w:w="2200"/>
+        <w:gridCol w:w="5626"/>
+        <w:gridCol w:w="1200"/>
       </w:tblGrid>
       <w:tr>
         <w:tc>
           <w:tcPr>
-            <w:tcW w:type="dxa" w:w="2600"/>
+            <w:tcW w:type="dxa" w:w="2200"/>
             <w:tcBorders>
               <w:top w:val="single" w:color="BBBBBB" w:sz="1"/>
               <w:left w:val="single" w:color="BBBBBB" w:sz="1"/>
@@ -1191,7 +1260,7 @@
         </w:tc>
         <w:tc>
           <w:tcPr>
-            <w:tcW w:type="dxa" w:w="6426"/>
+            <w:tcW w:type="dxa" w:w="5626"/>
             <w:tcBorders>
               <w:top w:val="single" w:color="BBBBBB" w:sz="1"/>
               <w:left w:val="single" w:color="BBBBBB" w:sz="1"/>
@@ -1222,11 +1291,44 @@
             </w:r>
           </w:p>
         </w:tc>
+        <w:tc>
+          <w:tcPr>
+            <w:tcW w:type="dxa" w:w="1200"/>
+            <w:tcBorders>
+              <w:top w:val="single" w:color="BBBBBB" w:sz="1"/>
+              <w:left w:val="single" w:color="BBBBBB" w:sz="1"/>
+              <w:bottom w:val="single" w:color="BBBBBB" w:sz="1"/>
+              <w:right w:val="single" w:color="BBBBBB" w:sz="1"/>
+            </w:tcBorders>
+            <w:shd w:fill="D5E8F0" w:val="clear"/>
+            <w:tcMar>
+              <w:top w:type="dxa" w:w="80"/>
+              <w:left w:type="dxa" w:w="120"/>
+              <w:bottom w:type="dxa" w:w="80"/>
+              <w:right w:type="dxa" w:w="120"/>
+            </w:tcMar>
+          </w:tcPr>
+          <w:p>
+            <w:pPr>
+              <w:jc w:val="center"/>
+            </w:pPr>
+            <w:r>
+              <w:rPr>
+                <w:rFonts w:ascii="Times New Roman" w:cs="Times New Roman" w:eastAsia="Times New Roman" w:hAnsi="Times New Roman"/>
+                <w:b/>
+                <w:bCs/>
+                <w:sz w:val="22"/>
+                <w:szCs w:val="22"/>
+              </w:rPr>
+              <w:t xml:space="preserve">Dòng</w:t>
+            </w:r>
+          </w:p>
+        </w:tc>
       </w:tr>
       <w:tr>
         <w:tc>
           <w:tcPr>
-            <w:tcW w:type="dxa" w:w="2600"/>
+            <w:tcW w:type="dxa" w:w="2200"/>
             <w:tcBorders>
               <w:top w:val="single" w:color="BBBBBB" w:sz="1"/>
               <w:left w:val="single" w:color="BBBBBB" w:sz="1"/>
@@ -1258,7 +1360,7 @@
         </w:tc>
         <w:tc>
           <w:tcPr>
-            <w:tcW w:type="dxa" w:w="6426"/>
+            <w:tcW w:type="dxa" w:w="5626"/>
             <w:tcBorders>
               <w:top w:val="single" w:color="BBBBBB" w:sz="1"/>
               <w:left w:val="single" w:color="BBBBBB" w:sz="1"/>
@@ -1285,6 +1387,38 @@
                 <w:szCs w:val="22"/>
               </w:rPr>
               <w:t xml:space="preserve">Khởi tạo cửa sổ, font, đồng hồ, rồi gọi reset()</w:t>
+            </w:r>
+          </w:p>
+        </w:tc>
+        <w:tc>
+          <w:tcPr>
+            <w:tcW w:type="dxa" w:w="1200"/>
+            <w:tcBorders>
+              <w:top w:val="single" w:color="BBBBBB" w:sz="1"/>
+              <w:left w:val="single" w:color="BBBBBB" w:sz="1"/>
+              <w:bottom w:val="single" w:color="BBBBBB" w:sz="1"/>
+              <w:right w:val="single" w:color="BBBBBB" w:sz="1"/>
+            </w:tcBorders>
+            <w:tcMar>
+              <w:top w:type="dxa" w:w="80"/>
+              <w:left w:type="dxa" w:w="120"/>
+              <w:bottom w:type="dxa" w:w="80"/>
+              <w:right w:type="dxa" w:w="120"/>
+            </w:tcMar>
+          </w:tcPr>
+          <w:p>
+            <w:pPr>
+              <w:jc w:val="center"/>
+            </w:pPr>
+            <w:r>
+              <w:rPr>
+                <w:rFonts w:ascii="Times New Roman" w:cs="Times New Roman" w:eastAsia="Times New Roman" w:hAnsi="Times New Roman"/>
+                <w:b w:val="false"/>
+                <w:bCs w:val="false"/>
+                <w:sz w:val="22"/>
+                <w:szCs w:val="22"/>
+              </w:rPr>
+              <w:t xml:space="preserve">68–75</w:t>
             </w:r>
           </w:p>
         </w:tc>
@@ -1292,7 +1426,7 @@
       <w:tr>
         <w:tc>
           <w:tcPr>
-            <w:tcW w:type="dxa" w:w="2600"/>
+            <w:tcW w:type="dxa" w:w="2200"/>
             <w:tcBorders>
               <w:top w:val="single" w:color="BBBBBB" w:sz="1"/>
               <w:left w:val="single" w:color="BBBBBB" w:sz="1"/>
@@ -1324,7 +1458,7 @@
         </w:tc>
         <w:tc>
           <w:tcPr>
-            <w:tcW w:type="dxa" w:w="6426"/>
+            <w:tcW w:type="dxa" w:w="5626"/>
             <w:tcBorders>
               <w:top w:val="single" w:color="BBBBBB" w:sz="1"/>
               <w:left w:val="single" w:color="BBBBBB" w:sz="1"/>
@@ -1351,6 +1485,38 @@
                 <w:szCs w:val="22"/>
               </w:rPr>
               <w:t xml:space="preserve">Đưa game về trạng thái đầu: rắn 3 đốt, điểm 0, tốc độ 6</w:t>
+            </w:r>
+          </w:p>
+        </w:tc>
+        <w:tc>
+          <w:tcPr>
+            <w:tcW w:type="dxa" w:w="1200"/>
+            <w:tcBorders>
+              <w:top w:val="single" w:color="BBBBBB" w:sz="1"/>
+              <w:left w:val="single" w:color="BBBBBB" w:sz="1"/>
+              <w:bottom w:val="single" w:color="BBBBBB" w:sz="1"/>
+              <w:right w:val="single" w:color="BBBBBB" w:sz="1"/>
+            </w:tcBorders>
+            <w:tcMar>
+              <w:top w:type="dxa" w:w="80"/>
+              <w:left w:type="dxa" w:w="120"/>
+              <w:bottom w:type="dxa" w:w="80"/>
+              <w:right w:type="dxa" w:w="120"/>
+            </w:tcMar>
+          </w:tcPr>
+          <w:p>
+            <w:pPr>
+              <w:jc w:val="center"/>
+            </w:pPr>
+            <w:r>
+              <w:rPr>
+                <w:rFonts w:ascii="Times New Roman" w:cs="Times New Roman" w:eastAsia="Times New Roman" w:hAnsi="Times New Roman"/>
+                <w:b w:val="false"/>
+                <w:bCs w:val="false"/>
+                <w:sz w:val="22"/>
+                <w:szCs w:val="22"/>
+              </w:rPr>
+              <w:t xml:space="preserve">78–92</w:t>
             </w:r>
           </w:p>
         </w:tc>
@@ -1358,7 +1524,7 @@
       <w:tr>
         <w:tc>
           <w:tcPr>
-            <w:tcW w:type="dxa" w:w="2600"/>
+            <w:tcW w:type="dxa" w:w="2200"/>
             <w:tcBorders>
               <w:top w:val="single" w:color="BBBBBB" w:sz="1"/>
               <w:left w:val="single" w:color="BBBBBB" w:sz="1"/>
@@ -1390,7 +1556,7 @@
         </w:tc>
         <w:tc>
           <w:tcPr>
-            <w:tcW w:type="dxa" w:w="6426"/>
+            <w:tcW w:type="dxa" w:w="5626"/>
             <w:tcBorders>
               <w:top w:val="single" w:color="BBBBBB" w:sz="1"/>
               <w:left w:val="single" w:color="BBBBBB" w:sz="1"/>
@@ -1417,6 +1583,38 @@
                 <w:szCs w:val="22"/>
               </w:rPr>
               <w:t xml:space="preserve">Vòng lặp chính: nhận sự kiện → update → draw, giới hạn 60 FPS</w:t>
+            </w:r>
+          </w:p>
+        </w:tc>
+        <w:tc>
+          <w:tcPr>
+            <w:tcW w:type="dxa" w:w="1200"/>
+            <w:tcBorders>
+              <w:top w:val="single" w:color="BBBBBB" w:sz="1"/>
+              <w:left w:val="single" w:color="BBBBBB" w:sz="1"/>
+              <w:bottom w:val="single" w:color="BBBBBB" w:sz="1"/>
+              <w:right w:val="single" w:color="BBBBBB" w:sz="1"/>
+            </w:tcBorders>
+            <w:tcMar>
+              <w:top w:type="dxa" w:w="80"/>
+              <w:left w:type="dxa" w:w="120"/>
+              <w:bottom w:type="dxa" w:w="80"/>
+              <w:right w:type="dxa" w:w="120"/>
+            </w:tcMar>
+          </w:tcPr>
+          <w:p>
+            <w:pPr>
+              <w:jc w:val="center"/>
+            </w:pPr>
+            <w:r>
+              <w:rPr>
+                <w:rFonts w:ascii="Times New Roman" w:cs="Times New Roman" w:eastAsia="Times New Roman" w:hAnsi="Times New Roman"/>
+                <w:b w:val="false"/>
+                <w:bCs w:val="false"/>
+                <w:sz w:val="22"/>
+                <w:szCs w:val="22"/>
+              </w:rPr>
+              <w:t xml:space="preserve">101–107</w:t>
             </w:r>
           </w:p>
         </w:tc>
@@ -1424,7 +1622,7 @@
       <w:tr>
         <w:tc>
           <w:tcPr>
-            <w:tcW w:type="dxa" w:w="2600"/>
+            <w:tcW w:type="dxa" w:w="2200"/>
             <w:tcBorders>
               <w:top w:val="single" w:color="BBBBBB" w:sz="1"/>
               <w:left w:val="single" w:color="BBBBBB" w:sz="1"/>
@@ -1456,7 +1654,7 @@
         </w:tc>
         <w:tc>
           <w:tcPr>
-            <w:tcW w:type="dxa" w:w="6426"/>
+            <w:tcW w:type="dxa" w:w="5626"/>
             <w:tcBorders>
               <w:top w:val="single" w:color="BBBBBB" w:sz="1"/>
               <w:left w:val="single" w:color="BBBBBB" w:sz="1"/>
@@ -1483,6 +1681,38 @@
                 <w:szCs w:val="22"/>
               </w:rPr>
               <w:t xml:space="preserve">Đọc bàn phím, xếp hướng đi vào hàng đợi, xử lý P / R / Esc</w:t>
+            </w:r>
+          </w:p>
+        </w:tc>
+        <w:tc>
+          <w:tcPr>
+            <w:tcW w:type="dxa" w:w="1200"/>
+            <w:tcBorders>
+              <w:top w:val="single" w:color="BBBBBB" w:sz="1"/>
+              <w:left w:val="single" w:color="BBBBBB" w:sz="1"/>
+              <w:bottom w:val="single" w:color="BBBBBB" w:sz="1"/>
+              <w:right w:val="single" w:color="BBBBBB" w:sz="1"/>
+            </w:tcBorders>
+            <w:tcMar>
+              <w:top w:type="dxa" w:w="80"/>
+              <w:left w:type="dxa" w:w="120"/>
+              <w:bottom w:type="dxa" w:w="80"/>
+              <w:right w:type="dxa" w:w="120"/>
+            </w:tcMar>
+          </w:tcPr>
+          <w:p>
+            <w:pPr>
+              <w:jc w:val="center"/>
+            </w:pPr>
+            <w:r>
+              <w:rPr>
+                <w:rFonts w:ascii="Times New Roman" w:cs="Times New Roman" w:eastAsia="Times New Roman" w:hAnsi="Times New Roman"/>
+                <w:b w:val="false"/>
+                <w:bCs w:val="false"/>
+                <w:sz w:val="22"/>
+                <w:szCs w:val="22"/>
+              </w:rPr>
+              <w:t xml:space="preserve">109–128</w:t>
             </w:r>
           </w:p>
         </w:tc>
@@ -1490,7 +1720,7 @@
       <w:tr>
         <w:tc>
           <w:tcPr>
-            <w:tcW w:type="dxa" w:w="2600"/>
+            <w:tcW w:type="dxa" w:w="2200"/>
             <w:tcBorders>
               <w:top w:val="single" w:color="BBBBBB" w:sz="1"/>
               <w:left w:val="single" w:color="BBBBBB" w:sz="1"/>
@@ -1522,7 +1752,7 @@
         </w:tc>
         <w:tc>
           <w:tcPr>
-            <w:tcW w:type="dxa" w:w="6426"/>
+            <w:tcW w:type="dxa" w:w="5626"/>
             <w:tcBorders>
               <w:top w:val="single" w:color="BBBBBB" w:sz="1"/>
               <w:left w:val="single" w:color="BBBBBB" w:sz="1"/>
@@ -1549,6 +1779,38 @@
                 <w:szCs w:val="22"/>
               </w:rPr>
               <w:t xml:space="preserve">Cộng dồn thời gian; đủ chu kỳ thì gọi step()</w:t>
+            </w:r>
+          </w:p>
+        </w:tc>
+        <w:tc>
+          <w:tcPr>
+            <w:tcW w:type="dxa" w:w="1200"/>
+            <w:tcBorders>
+              <w:top w:val="single" w:color="BBBBBB" w:sz="1"/>
+              <w:left w:val="single" w:color="BBBBBB" w:sz="1"/>
+              <w:bottom w:val="single" w:color="BBBBBB" w:sz="1"/>
+              <w:right w:val="single" w:color="BBBBBB" w:sz="1"/>
+            </w:tcBorders>
+            <w:tcMar>
+              <w:top w:type="dxa" w:w="80"/>
+              <w:left w:type="dxa" w:w="120"/>
+              <w:bottom w:type="dxa" w:w="80"/>
+              <w:right w:type="dxa" w:w="120"/>
+            </w:tcMar>
+          </w:tcPr>
+          <w:p>
+            <w:pPr>
+              <w:jc w:val="center"/>
+            </w:pPr>
+            <w:r>
+              <w:rPr>
+                <w:rFonts w:ascii="Times New Roman" w:cs="Times New Roman" w:eastAsia="Times New Roman" w:hAnsi="Times New Roman"/>
+                <w:b w:val="false"/>
+                <w:bCs w:val="false"/>
+                <w:sz w:val="22"/>
+                <w:szCs w:val="22"/>
+              </w:rPr>
+              <w:t xml:space="preserve">131–139</w:t>
             </w:r>
           </w:p>
         </w:tc>
@@ -1556,7 +1818,7 @@
       <w:tr>
         <w:tc>
           <w:tcPr>
-            <w:tcW w:type="dxa" w:w="2600"/>
+            <w:tcW w:type="dxa" w:w="2200"/>
             <w:tcBorders>
               <w:top w:val="single" w:color="BBBBBB" w:sz="1"/>
               <w:left w:val="single" w:color="BBBBBB" w:sz="1"/>
@@ -1588,7 +1850,7 @@
         </w:tc>
         <w:tc>
           <w:tcPr>
-            <w:tcW w:type="dxa" w:w="6426"/>
+            <w:tcW w:type="dxa" w:w="5626"/>
             <w:tcBorders>
               <w:top w:val="single" w:color="BBBBBB" w:sz="1"/>
               <w:left w:val="single" w:color="BBBBBB" w:sz="1"/>
@@ -1615,6 +1877,38 @@
                 <w:szCs w:val="22"/>
               </w:rPr>
               <w:t xml:space="preserve">Một bước logic: hết hạn mồi vàng, đổi hướng, di chuyển, ăn mồi, va chạm, tăng tốc</w:t>
+            </w:r>
+          </w:p>
+        </w:tc>
+        <w:tc>
+          <w:tcPr>
+            <w:tcW w:type="dxa" w:w="1200"/>
+            <w:tcBorders>
+              <w:top w:val="single" w:color="BBBBBB" w:sz="1"/>
+              <w:left w:val="single" w:color="BBBBBB" w:sz="1"/>
+              <w:bottom w:val="single" w:color="BBBBBB" w:sz="1"/>
+              <w:right w:val="single" w:color="BBBBBB" w:sz="1"/>
+            </w:tcBorders>
+            <w:tcMar>
+              <w:top w:type="dxa" w:w="80"/>
+              <w:left w:type="dxa" w:w="120"/>
+              <w:bottom w:type="dxa" w:w="80"/>
+              <w:right w:type="dxa" w:w="120"/>
+            </w:tcMar>
+          </w:tcPr>
+          <w:p>
+            <w:pPr>
+              <w:jc w:val="center"/>
+            </w:pPr>
+            <w:r>
+              <w:rPr>
+                <w:rFonts w:ascii="Times New Roman" w:cs="Times New Roman" w:eastAsia="Times New Roman" w:hAnsi="Times New Roman"/>
+                <w:b w:val="false"/>
+                <w:bCs w:val="false"/>
+                <w:sz w:val="22"/>
+                <w:szCs w:val="22"/>
+              </w:rPr>
+              <w:t xml:space="preserve">141–190</w:t>
             </w:r>
           </w:p>
         </w:tc>
@@ -1622,7 +1916,7 @@
       <w:tr>
         <w:tc>
           <w:tcPr>
-            <w:tcW w:type="dxa" w:w="2600"/>
+            <w:tcW w:type="dxa" w:w="2200"/>
             <w:tcBorders>
               <w:top w:val="single" w:color="BBBBBB" w:sz="1"/>
               <w:left w:val="single" w:color="BBBBBB" w:sz="1"/>
@@ -1654,7 +1948,7 @@
         </w:tc>
         <w:tc>
           <w:tcPr>
-            <w:tcW w:type="dxa" w:w="6426"/>
+            <w:tcW w:type="dxa" w:w="5626"/>
             <w:tcBorders>
               <w:top w:val="single" w:color="BBBBBB" w:sz="1"/>
               <w:left w:val="single" w:color="BBBBBB" w:sz="1"/>
@@ -1681,6 +1975,38 @@
                 <w:szCs w:val="22"/>
               </w:rPr>
               <w:t xml:space="preserve">Sinh mồi thường ở ô trống ngẫu nhiên</w:t>
+            </w:r>
+          </w:p>
+        </w:tc>
+        <w:tc>
+          <w:tcPr>
+            <w:tcW w:type="dxa" w:w="1200"/>
+            <w:tcBorders>
+              <w:top w:val="single" w:color="BBBBBB" w:sz="1"/>
+              <w:left w:val="single" w:color="BBBBBB" w:sz="1"/>
+              <w:bottom w:val="single" w:color="BBBBBB" w:sz="1"/>
+              <w:right w:val="single" w:color="BBBBBB" w:sz="1"/>
+            </w:tcBorders>
+            <w:tcMar>
+              <w:top w:type="dxa" w:w="80"/>
+              <w:left w:type="dxa" w:w="120"/>
+              <w:bottom w:type="dxa" w:w="80"/>
+              <w:right w:type="dxa" w:w="120"/>
+            </w:tcMar>
+          </w:tcPr>
+          <w:p>
+            <w:pPr>
+              <w:jc w:val="center"/>
+            </w:pPr>
+            <w:r>
+              <w:rPr>
+                <w:rFonts w:ascii="Times New Roman" w:cs="Times New Roman" w:eastAsia="Times New Roman" w:hAnsi="Times New Roman"/>
+                <w:b w:val="false"/>
+                <w:bCs w:val="false"/>
+                <w:sz w:val="22"/>
+                <w:szCs w:val="22"/>
+              </w:rPr>
+              <w:t xml:space="preserve">94–98</w:t>
             </w:r>
           </w:p>
         </w:tc>
@@ -1688,7 +2014,7 @@
       <w:tr>
         <w:tc>
           <w:tcPr>
-            <w:tcW w:type="dxa" w:w="2600"/>
+            <w:tcW w:type="dxa" w:w="2200"/>
             <w:tcBorders>
               <w:top w:val="single" w:color="BBBBBB" w:sz="1"/>
               <w:left w:val="single" w:color="BBBBBB" w:sz="1"/>
@@ -1720,7 +2046,7 @@
         </w:tc>
         <w:tc>
           <w:tcPr>
-            <w:tcW w:type="dxa" w:w="6426"/>
+            <w:tcW w:type="dxa" w:w="5626"/>
             <w:tcBorders>
               <w:top w:val="single" w:color="BBBBBB" w:sz="1"/>
               <w:left w:val="single" w:color="BBBBBB" w:sz="1"/>
@@ -1747,11 +2073,68 @@
                 <w:szCs w:val="22"/>
               </w:rPr>
               <w:t xml:space="preserve">Vẽ bàn cờ, mồi, rắn, HUD, màn hình thua / tạm dừng</w:t>
+            </w:r>
+          </w:p>
+        </w:tc>
+        <w:tc>
+          <w:tcPr>
+            <w:tcW w:type="dxa" w:w="1200"/>
+            <w:tcBorders>
+              <w:top w:val="single" w:color="BBBBBB" w:sz="1"/>
+              <w:left w:val="single" w:color="BBBBBB" w:sz="1"/>
+              <w:bottom w:val="single" w:color="BBBBBB" w:sz="1"/>
+              <w:right w:val="single" w:color="BBBBBB" w:sz="1"/>
+            </w:tcBorders>
+            <w:tcMar>
+              <w:top w:type="dxa" w:w="80"/>
+              <w:left w:type="dxa" w:w="120"/>
+              <w:bottom w:type="dxa" w:w="80"/>
+              <w:right w:type="dxa" w:w="120"/>
+            </w:tcMar>
+          </w:tcPr>
+          <w:p>
+            <w:pPr>
+              <w:jc w:val="center"/>
+            </w:pPr>
+            <w:r>
+              <w:rPr>
+                <w:rFonts w:ascii="Times New Roman" w:cs="Times New Roman" w:eastAsia="Times New Roman" w:hAnsi="Times New Roman"/>
+                <w:b w:val="false"/>
+                <w:bCs w:val="false"/>
+                <w:sz w:val="22"/>
+                <w:szCs w:val="22"/>
+              </w:rPr>
+              <w:t xml:space="preserve">193–244</w:t>
             </w:r>
           </w:p>
         </w:tc>
       </w:tr>
     </w:tbl>
+    <w:p>
+      <w:pPr>
+        <w:spacing w:after="140"/>
+      </w:pPr>
+      <w:r>
+        <w:rPr>
+          <w:rFonts w:ascii="Times New Roman" w:cs="Times New Roman" w:eastAsia="Times New Roman" w:hAnsi="Times New Roman"/>
+          <w:b/>
+          <w:bCs/>
+          <w:color w:val="666666"/>
+          <w:sz w:val="20"/>
+          <w:szCs w:val="20"/>
+        </w:rPr>
+        <w:t xml:space="preserve">Mã nguồn: </w:t>
+      </w:r>
+      <w:r>
+        <w:rPr>
+          <w:rFonts w:ascii="Consolas" w:cs="Consolas" w:eastAsia="Consolas" w:hAnsi="Consolas"/>
+          <w:color w:val="555555"/>
+          <w:sz w:val="19"/>
+          <w:szCs w:val="19"/>
+        </w:rPr>
+        <w:t xml:space="preserve">random_free_cell 59–64 · main 274–275 · _selftest 279–381.</w:t>
+      </w:r>
+    </w:p>
     <w:p>
       <w:pPr>
         <w:pStyle w:val="Heading2"/>
@@ -1783,6 +2166,31 @@
     </w:p>
     <w:p>
       <w:pPr>
+        <w:spacing w:after="140"/>
+      </w:pPr>
+      <w:r>
+        <w:rPr>
+          <w:rFonts w:ascii="Times New Roman" w:cs="Times New Roman" w:eastAsia="Times New Roman" w:hAnsi="Times New Roman"/>
+          <w:b/>
+          <w:bCs/>
+          <w:color w:val="666666"/>
+          <w:sz w:val="20"/>
+          <w:szCs w:val="20"/>
+        </w:rPr>
+        <w:t xml:space="preserve">Mã nguồn: </w:t>
+      </w:r>
+      <w:r>
+        <w:rPr>
+          <w:rFonts w:ascii="Consolas" w:cs="Consolas" w:eastAsia="Consolas" w:hAnsi="Consolas"/>
+          <w:color w:val="555555"/>
+          <w:sz w:val="19"/>
+          <w:szCs w:val="19"/>
+        </w:rPr>
+        <w:t xml:space="preserve">snake.py · dòng 78–92 — Game.reset() khởi tạo deque; dòng 173–175 — appendleft() và pop() trong Game.step().</w:t>
+      </w:r>
+    </w:p>
+    <w:p>
+      <w:pPr>
         <w:pStyle w:val="Heading2"/>
       </w:pPr>
       <w:r>
@@ -1812,6 +2220,31 @@
     </w:p>
     <w:p>
       <w:pPr>
+        <w:spacing w:after="140"/>
+      </w:pPr>
+      <w:r>
+        <w:rPr>
+          <w:rFonts w:ascii="Times New Roman" w:cs="Times New Roman" w:eastAsia="Times New Roman" w:hAnsi="Times New Roman"/>
+          <w:b/>
+          <w:bCs/>
+          <w:color w:val="666666"/>
+          <w:sz w:val="20"/>
+          <w:szCs w:val="20"/>
+        </w:rPr>
+        <w:t xml:space="preserve">Mã nguồn: </w:t>
+      </w:r>
+      <w:r>
+        <w:rPr>
+          <w:rFonts w:ascii="Consolas" w:cs="Consolas" w:eastAsia="Consolas" w:hAnsi="Consolas"/>
+          <w:color w:val="555555"/>
+          <w:sz w:val="19"/>
+          <w:szCs w:val="19"/>
+        </w:rPr>
+        <w:t xml:space="preserve">snake.py · dòng 39–45 — bảng DIRS; dòng 109–128 — Game.handle_events(); dòng 147–151 — nhận hướng, chặn 180° trong Game.step().</w:t>
+      </w:r>
+    </w:p>
+    <w:p>
+      <w:pPr>
         <w:pStyle w:val="Heading2"/>
       </w:pPr>
       <w:r>
@@ -1841,6 +2274,31 @@
     </w:p>
     <w:p>
       <w:pPr>
+        <w:spacing w:after="140"/>
+      </w:pPr>
+      <w:r>
+        <w:rPr>
+          <w:rFonts w:ascii="Times New Roman" w:cs="Times New Roman" w:eastAsia="Times New Roman" w:hAnsi="Times New Roman"/>
+          <w:b/>
+          <w:bCs/>
+          <w:color w:val="666666"/>
+          <w:sz w:val="20"/>
+          <w:szCs w:val="20"/>
+        </w:rPr>
+        <w:t xml:space="preserve">Mã nguồn: </w:t>
+      </w:r>
+      <w:r>
+        <w:rPr>
+          <w:rFonts w:ascii="Consolas" w:cs="Consolas" w:eastAsia="Consolas" w:hAnsi="Consolas"/>
+          <w:color w:val="555555"/>
+          <w:sz w:val="19"/>
+          <w:szCs w:val="19"/>
+        </w:rPr>
+        <w:t xml:space="preserve">snake.py · dòng 59–64 — random_free_cell(); dòng 94–98 — Game.spawn_food(); dòng 177–182 — xử lý ăn mồi trong Game.step().</w:t>
+      </w:r>
+    </w:p>
+    <w:p>
+      <w:pPr>
         <w:pStyle w:val="Heading2"/>
       </w:pPr>
       <w:r>
@@ -1870,6 +2328,31 @@
     </w:p>
     <w:p>
       <w:pPr>
+        <w:spacing w:after="140"/>
+      </w:pPr>
+      <w:r>
+        <w:rPr>
+          <w:rFonts w:ascii="Times New Roman" w:cs="Times New Roman" w:eastAsia="Times New Roman" w:hAnsi="Times New Roman"/>
+          <w:b/>
+          <w:bCs/>
+          <w:color w:val="666666"/>
+          <w:sz w:val="20"/>
+          <w:szCs w:val="20"/>
+        </w:rPr>
+        <w:t xml:space="preserve">Mã nguồn: </w:t>
+      </w:r>
+      <w:r>
+        <w:rPr>
+          <w:rFonts w:ascii="Consolas" w:cs="Consolas" w:eastAsia="Consolas" w:hAnsi="Consolas"/>
+          <w:color w:val="555555"/>
+          <w:sz w:val="19"/>
+          <w:szCs w:val="19"/>
+        </w:rPr>
+        <w:t xml:space="preserve">snake.py · dòng 142–145 — kiểm tra hết hạn; dòng 187–190 — sinh mồi vàng; dòng 183–185 — cộng +5; dòng 246–262 — thanh đếm ngược trong Game.draw_hud().</w:t>
+      </w:r>
+    </w:p>
+    <w:p>
+      <w:pPr>
         <w:pStyle w:val="Heading2"/>
       </w:pPr>
       <w:r>
@@ -1899,6 +2382,31 @@
     </w:p>
     <w:p>
       <w:pPr>
+        <w:spacing w:after="140"/>
+      </w:pPr>
+      <w:r>
+        <w:rPr>
+          <w:rFonts w:ascii="Times New Roman" w:cs="Times New Roman" w:eastAsia="Times New Roman" w:hAnsi="Times New Roman"/>
+          <w:b/>
+          <w:bCs/>
+          <w:color w:val="666666"/>
+          <w:sz w:val="20"/>
+          <w:szCs w:val="20"/>
+        </w:rPr>
+        <w:t xml:space="preserve">Mã nguồn: </w:t>
+      </w:r>
+      <w:r>
+        <w:rPr>
+          <w:rFonts w:ascii="Consolas" w:cs="Consolas" w:eastAsia="Consolas" w:hAnsi="Consolas"/>
+          <w:color w:val="555555"/>
+          <w:sz w:val="19"/>
+          <w:szCs w:val="19"/>
+        </w:rPr>
+        <w:t xml:space="preserve">snake.py · dòng 180–181 — eaten % 5 và giới hạn MAX_SPEED trong Game.step(); dòng 136 — interval = 1000 / speed trong Game.update().</w:t>
+      </w:r>
+    </w:p>
+    <w:p>
+      <w:pPr>
         <w:pStyle w:val="Heading2"/>
       </w:pPr>
       <w:r>
@@ -1982,6 +2490,31 @@
     </w:p>
     <w:p>
       <w:pPr>
+        <w:spacing w:after="140"/>
+      </w:pPr>
+      <w:r>
+        <w:rPr>
+          <w:rFonts w:ascii="Times New Roman" w:cs="Times New Roman" w:eastAsia="Times New Roman" w:hAnsi="Times New Roman"/>
+          <w:b/>
+          <w:bCs/>
+          <w:color w:val="666666"/>
+          <w:sz w:val="20"/>
+          <w:szCs w:val="20"/>
+        </w:rPr>
+        <w:t xml:space="preserve">Mã nguồn: </w:t>
+      </w:r>
+      <w:r>
+        <w:rPr>
+          <w:rFonts w:ascii="Consolas" w:cs="Consolas" w:eastAsia="Consolas" w:hAnsi="Consolas"/>
+          <w:color w:val="555555"/>
+          <w:sz w:val="19"/>
+          <w:szCs w:val="19"/>
+        </w:rPr>
+        <w:t xml:space="preserve">snake.py · dòng 153–170, 167 — va chạm trong Game.step().</w:t>
+      </w:r>
+    </w:p>
+    <w:p>
+      <w:pPr>
         <w:pStyle w:val="Heading2"/>
       </w:pPr>
       <w:r>
@@ -2011,6 +2544,31 @@
     </w:p>
     <w:p>
       <w:pPr>
+        <w:spacing w:after="140"/>
+      </w:pPr>
+      <w:r>
+        <w:rPr>
+          <w:rFonts w:ascii="Times New Roman" w:cs="Times New Roman" w:eastAsia="Times New Roman" w:hAnsi="Times New Roman"/>
+          <w:b/>
+          <w:bCs/>
+          <w:color w:val="666666"/>
+          <w:sz w:val="20"/>
+          <w:szCs w:val="20"/>
+        </w:rPr>
+        <w:t xml:space="preserve">Mã nguồn: </w:t>
+      </w:r>
+      <w:r>
+        <w:rPr>
+          <w:rFonts w:ascii="Consolas" w:cs="Consolas" w:eastAsia="Consolas" w:hAnsi="Consolas"/>
+          <w:color w:val="555555"/>
+          <w:sz w:val="19"/>
+          <w:szCs w:val="19"/>
+        </w:rPr>
+        <w:t xml:space="preserve">snake.py · dòng 193–244 — Game.draw(); dòng 246–262 — Game.draw_hud(); dòng 264–271 — Game.draw_center_overlay().</w:t>
+      </w:r>
+    </w:p>
+    <w:p>
+      <w:pPr>
         <w:pStyle w:val="Heading1"/>
       </w:pPr>
       <w:r>
@@ -2130,6 +2688,31 @@
     </w:p>
     <w:p>
       <w:pPr>
+        <w:spacing w:after="140"/>
+      </w:pPr>
+      <w:r>
+        <w:rPr>
+          <w:rFonts w:ascii="Times New Roman" w:cs="Times New Roman" w:eastAsia="Times New Roman" w:hAnsi="Times New Roman"/>
+          <w:b/>
+          <w:bCs/>
+          <w:color w:val="666666"/>
+          <w:sz w:val="20"/>
+          <w:szCs w:val="20"/>
+        </w:rPr>
+        <w:t xml:space="preserve">Mã nguồn: </w:t>
+      </w:r>
+      <w:r>
+        <w:rPr>
+          <w:rFonts w:ascii="Consolas" w:cs="Consolas" w:eastAsia="Consolas" w:hAnsi="Consolas"/>
+          <w:color w:val="555555"/>
+          <w:sz w:val="19"/>
+          <w:szCs w:val="19"/>
+        </w:rPr>
+        <w:t xml:space="preserve">snake.py · dòng 147–151 (chặn 180°) · 167 (ô đuôi) · 59–64 (tránh trùng ô) · 142–145 (hết hạn mồi vàng) · 133–134 (tạm dừng).</w:t>
+      </w:r>
+    </w:p>
+    <w:p>
+      <w:pPr>
         <w:pStyle w:val="Heading1"/>
       </w:pPr>
       <w:r>
@@ -2155,6 +2738,31 @@
           <w:szCs w:val="24"/>
         </w:rPr>
         <w:t xml:space="preserve">Ngoài việc chơi thử bằng tay, dự án có sẵn bộ tự kiểm tra chạy hoàn toàn headless: python snake.py --selftest. Bộ test dùng driver video giả của SDL, tắt spawn ngẫu nhiên mồi vàng và cố định seed ngẫu nhiên để kết quả lặp lại được. Các kịch bản và kết quả mong đợi:</w:t>
+      </w:r>
+    </w:p>
+    <w:p>
+      <w:pPr>
+        <w:spacing w:after="140"/>
+      </w:pPr>
+      <w:r>
+        <w:rPr>
+          <w:rFonts w:ascii="Times New Roman" w:cs="Times New Roman" w:eastAsia="Times New Roman" w:hAnsi="Times New Roman"/>
+          <w:b/>
+          <w:bCs/>
+          <w:color w:val="666666"/>
+          <w:sz w:val="20"/>
+          <w:szCs w:val="20"/>
+        </w:rPr>
+        <w:t xml:space="preserve">Mã nguồn: </w:t>
+      </w:r>
+      <w:r>
+        <w:rPr>
+          <w:rFonts w:ascii="Consolas" w:cs="Consolas" w:eastAsia="Consolas" w:hAnsi="Consolas"/>
+          <w:color w:val="555555"/>
+          <w:sz w:val="19"/>
+          <w:szCs w:val="19"/>
+        </w:rPr>
+        <w:t xml:space="preserve">snake.py · dòng 279–381 — _selftest(), 9 nhóm kiểm tra tương ứng bảng dưới.</w:t>
       </w:r>
     </w:p>
     <w:tbl>
@@ -2175,6 +2783,9 @@
         <w:gridCol w:w="4126"/>
       </w:tblGrid>
       <w:tr>
+        <w:trPr>
+          <w:tblHeader/>
+        </w:trPr>
         <w:tc>
           <w:tcPr>
             <w:tcW w:type="dxa" w:w="600"/>

</xml_diff>

<commit_message>
fix: nut choi lai bam duoc, R moi luc, dieu khien WASD
</commit_message>
<xml_diff>
--- a/docs/Bai-4-Ran-san-moi-Bao-cao-cach-lam.docx
+++ b/docs/Bai-4-Ran-san-moi-Bao-cao-cach-lam.docx
@@ -403,7 +403,7 @@
           <w:sz w:val="19"/>
           <w:szCs w:val="19"/>
         </w:rPr>
-        <w:t xml:space="preserve">snake.py · dòng 131–139 (update) · 142–145 (step).</w:t>
+        <w:t xml:space="preserve">snake.py · dòng 137–145 (update) · 148–151 (step).</w:t>
       </w:r>
     </w:p>
     <w:p>
@@ -1146,7 +1146,7 @@
           <w:sz w:val="19"/>
           <w:szCs w:val="19"/>
         </w:rPr>
-        <w:t xml:space="preserve">snake.py · dòng 24–37 — khối hằng số cấu hình; dòng 39–45 — bảng DIRS.</w:t>
+        <w:t xml:space="preserve">snake.py · dòng 24–37 — khối hằng số cấu hình; dòng 39–44 — bảng DIRS.</w:t>
       </w:r>
     </w:p>
     <w:p>
@@ -1418,7 +1418,7 @@
                 <w:sz w:val="22"/>
                 <w:szCs w:val="22"/>
               </w:rPr>
-              <w:t xml:space="preserve">68–75</w:t>
+              <w:t xml:space="preserve">68–76</w:t>
             </w:r>
           </w:p>
         </w:tc>
@@ -1516,7 +1516,7 @@
                 <w:sz w:val="22"/>
                 <w:szCs w:val="22"/>
               </w:rPr>
-              <w:t xml:space="preserve">78–92</w:t>
+              <w:t xml:space="preserve">79–92</w:t>
             </w:r>
           </w:p>
         </w:tc>
@@ -1680,7 +1680,7 @@
                 <w:sz w:val="22"/>
                 <w:szCs w:val="22"/>
               </w:rPr>
-              <w:t xml:space="preserve">Đọc bàn phím, xếp hướng đi vào hàng đợi, xử lý P / R / Esc</w:t>
+              <w:t xml:space="preserve">Đọc bàn phím / chuột, xếp hướng, xử lý P / R / Esc và nút chơi lại</w:t>
             </w:r>
           </w:p>
         </w:tc>
@@ -1712,7 +1712,7 @@
                 <w:sz w:val="22"/>
                 <w:szCs w:val="22"/>
               </w:rPr>
-              <w:t xml:space="preserve">109–128</w:t>
+              <w:t xml:space="preserve">109–134</w:t>
             </w:r>
           </w:p>
         </w:tc>
@@ -1810,7 +1810,7 @@
                 <w:sz w:val="22"/>
                 <w:szCs w:val="22"/>
               </w:rPr>
-              <w:t xml:space="preserve">131–139</w:t>
+              <w:t xml:space="preserve">137–145</w:t>
             </w:r>
           </w:p>
         </w:tc>
@@ -1908,7 +1908,7 @@
                 <w:sz w:val="22"/>
                 <w:szCs w:val="22"/>
               </w:rPr>
-              <w:t xml:space="preserve">141–190</w:t>
+              <w:t xml:space="preserve">147–196</w:t>
             </w:r>
           </w:p>
         </w:tc>
@@ -2072,7 +2072,7 @@
                 <w:sz w:val="22"/>
                 <w:szCs w:val="22"/>
               </w:rPr>
-              <w:t xml:space="preserve">Vẽ bàn cờ, mồi, rắn, HUD, màn hình thua / tạm dừng</w:t>
+              <w:t xml:space="preserve">Vẽ bàn cờ, mồi, rắn, HUD, màn hình thua / tạm dừng, nút chơi lại</w:t>
             </w:r>
           </w:p>
         </w:tc>
@@ -2104,7 +2104,7 @@
                 <w:sz w:val="22"/>
                 <w:szCs w:val="22"/>
               </w:rPr>
-              <w:t xml:space="preserve">193–244</w:t>
+              <w:t xml:space="preserve">199–251</w:t>
             </w:r>
           </w:p>
         </w:tc>
@@ -2132,7 +2132,7 @@
           <w:sz w:val="19"/>
           <w:szCs w:val="19"/>
         </w:rPr>
-        <w:t xml:space="preserve">random_free_cell 59–64 · main 274–275 · _selftest 279–381.</w:t>
+        <w:t xml:space="preserve">random_free_cell 59–64 · main 298–299 · _selftest 303–433.</w:t>
       </w:r>
     </w:p>
     <w:p>
@@ -2186,7 +2186,7 @@
           <w:sz w:val="19"/>
           <w:szCs w:val="19"/>
         </w:rPr>
-        <w:t xml:space="preserve">snake.py · dòng 78–92 — Game.reset() khởi tạo deque; dòng 173–175 — appendleft() và pop() trong Game.step().</w:t>
+        <w:t xml:space="preserve">snake.py · dòng 79–92 — Game.reset() khởi tạo deque; dòng 179–181 — appendleft() và pop() trong Game.step().</w:t>
       </w:r>
     </w:p>
     <w:p>
@@ -2215,7 +2215,7 @@
           <w:sz w:val="24"/>
           <w:szCs w:val="24"/>
         </w:rPr>
-        <w:t xml:space="preserve">Bàn phím được ánh xạ thành bốn vector hướng: (0,-1) lên, (0,1) xuống, (-1,0) trái, (1,0) phải. Các hướng người chơi bấm được xếp vào hàng đợi pending (tối đa 2 phần tử) và mỗi bước rắn chỉ lấy ra một hướng. Cơ chế này chặn hai lỗi kinh điển: (1) bấm ngược chiều 180° làm rắn tự đâm đầu vào cổ — vector bị loại nếu tổng với hướng hiện tại bằng (0,0); (2) bấm hai phím liên tiếp trong cùng một bước làm rắn đổi hướng hai lần và chết oan.</w:t>
+        <w:t xml:space="preserve">Bốn phím W/A/S/D được ánh xạ thành bốn vector hướng: (0,-1) lên, (0,1) xuống, (-1,0) trái, (1,0) phải. Các hướng người chơi bấm được xếp vào hàng đợi pending (tối đa 2 phần tử) và mỗi bước rắn chỉ lấy ra một hướng. Cơ chế này chặn hai lỗi kinh điển: (1) bấm ngược chiều 180° làm rắn tự đâm đầu vào cổ — vector bị loại nếu tổng với hướng hiện tại bằng (0,0); (2) bấm hai phím liên tiếp trong cùng một bước làm rắn đổi hướng hai lần và chết oan.</w:t>
       </w:r>
     </w:p>
     <w:p>
@@ -2240,7 +2240,7 @@
           <w:sz w:val="19"/>
           <w:szCs w:val="19"/>
         </w:rPr>
-        <w:t xml:space="preserve">snake.py · dòng 39–45 — bảng DIRS; dòng 109–128 — Game.handle_events(); dòng 147–151 — nhận hướng, chặn 180° trong Game.step().</w:t>
+        <w:t xml:space="preserve">snake.py · dòng 39–44 — bảng DIRS; dòng 109–134 — Game.handle_events(); dòng 153–157 — nhận hướng, chặn 180° trong Game.step().</w:t>
       </w:r>
     </w:p>
     <w:p>
@@ -2294,7 +2294,7 @@
           <w:sz w:val="19"/>
           <w:szCs w:val="19"/>
         </w:rPr>
-        <w:t xml:space="preserve">snake.py · dòng 59–64 — random_free_cell(); dòng 94–98 — Game.spawn_food(); dòng 177–182 — xử lý ăn mồi trong Game.step().</w:t>
+        <w:t xml:space="preserve">snake.py · dòng 59–64 — random_free_cell(); dòng 94–98 — Game.spawn_food(); dòng 183–188 — xử lý ăn mồi trong Game.step().</w:t>
       </w:r>
     </w:p>
     <w:p>
@@ -2348,7 +2348,7 @@
           <w:sz w:val="19"/>
           <w:szCs w:val="19"/>
         </w:rPr>
-        <w:t xml:space="preserve">snake.py · dòng 142–145 — kiểm tra hết hạn; dòng 187–190 — sinh mồi vàng; dòng 183–185 — cộng +5; dòng 246–262 — thanh đếm ngược trong Game.draw_hud().</w:t>
+        <w:t xml:space="preserve">snake.py · dòng 148–151 — kiểm tra hết hạn; dòng 193–196 — sinh mồi vàng; dòng 189–191 — cộng +5; dòng 253–269 — thanh đếm ngược trong Game.draw_hud().</w:t>
       </w:r>
     </w:p>
     <w:p>
@@ -2402,7 +2402,7 @@
           <w:sz w:val="19"/>
           <w:szCs w:val="19"/>
         </w:rPr>
-        <w:t xml:space="preserve">snake.py · dòng 180–181 — eaten % 5 và giới hạn MAX_SPEED trong Game.step(); dòng 136 — interval = 1000 / speed trong Game.update().</w:t>
+        <w:t xml:space="preserve">snake.py · dòng 186–187 — eaten % 5 và giới hạn MAX_SPEED trong Game.step(); dòng 142 — interval = 1000 / speed trong Game.update().</w:t>
       </w:r>
     </w:p>
     <w:p>
@@ -2485,7 +2485,7 @@
           <w:sz w:val="24"/>
           <w:szCs w:val="24"/>
         </w:rPr>
-        <w:t xml:space="preserve">Khi thua, game dừng cập nhật, vẽ lớp phủ tối kèm thông báo điểm; người chơi nhấn R để chơi lại hoặc Esc để thoát.</w:t>
+        <w:t xml:space="preserve">Khi thua, game dừng cập nhật, vẽ lớp phủ tối kèm thông báo điểm và nút CHƠI LẠI; người chơi bấm nút, nhấn R (hoặc Enter) để chơi lại, hay Esc để thoát.</w:t>
       </w:r>
     </w:p>
     <w:p>
@@ -2510,7 +2510,7 @@
           <w:sz w:val="19"/>
           <w:szCs w:val="19"/>
         </w:rPr>
-        <w:t xml:space="preserve">snake.py · dòng 153–170, 167 — va chạm trong Game.step().</w:t>
+        <w:t xml:space="preserve">snake.py · dòng 159–176, 173 — va chạm trong Game.step().</w:t>
       </w:r>
     </w:p>
     <w:p>
@@ -2539,7 +2539,7 @@
           <w:sz w:val="24"/>
           <w:szCs w:val="24"/>
         </w:rPr>
-        <w:t xml:space="preserve">Thanh trạng thái 40 px phía trên hiển thị: điểm hiện tại, tiến độ tới lần tăng tốc kế tiếp (x/5), tốc độ hiện tại và kỷ lục trong phiên. Khi có mồi vàng, góc phải hiện thanh thời gian còn lại. Rắn được vẽ bo góc, đầu sáng hơn thân và có hai mắt trắng xoay theo hướng di chuyển; mồi vàng phóng to thu nhỏ theo chu kỳ 400 ms để gây chú ý.</w:t>
+        <w:t xml:space="preserve">Thanh trạng thái 40 px phía trên hiển thị: điểm hiện tại, tiến độ tới lần tăng tốc kế tiếp (x/5), tốc độ hiện tại và kỷ lục trong phiên. Khi có mồi vàng, góc phải hiện thanh thời gian còn lại. Rắn được vẽ bo góc, đầu sáng hơn thân và có hai mắt trắng xoay theo hướng di chuyển; mồi vàng phóng to thu nhỏ theo chu kỳ 400 ms để gây chú ý. Khi thua, lớp phủ hiện điểm và nút CHƠI LẠI bấm được bằng chuột; phím R hoặc Enter cũng chơi lại được.</w:t>
       </w:r>
     </w:p>
     <w:p>
@@ -2564,7 +2564,7 @@
           <w:sz w:val="19"/>
           <w:szCs w:val="19"/>
         </w:rPr>
-        <w:t xml:space="preserve">snake.py · dòng 193–244 — Game.draw(); dòng 246–262 — Game.draw_hud(); dòng 264–271 — Game.draw_center_overlay().</w:t>
+        <w:t xml:space="preserve">snake.py · dòng 199–251 — Game.draw(); dòng 253–269 — Game.draw_hud(); dòng 271–278 — Game.draw_center_overlay(); dòng 280–295 — nút chơi lại.</w:t>
       </w:r>
     </w:p>
     <w:p>
@@ -2708,7 +2708,7 @@
           <w:sz w:val="19"/>
           <w:szCs w:val="19"/>
         </w:rPr>
-        <w:t xml:space="preserve">snake.py · dòng 147–151 (chặn 180°) · 167 (ô đuôi) · 59–64 (tránh trùng ô) · 142–145 (hết hạn mồi vàng) · 133–134 (tạm dừng).</w:t>
+        <w:t xml:space="preserve">snake.py · dòng 153–157 (chặn 180°) · 173 (ô đuôi) · 59–64 (tránh trùng ô) · 148–151 (hết hạn mồi vàng) · 139–140 (tạm dừng).</w:t>
       </w:r>
     </w:p>
     <w:p>
@@ -2762,7 +2762,7 @@
           <w:sz w:val="19"/>
           <w:szCs w:val="19"/>
         </w:rPr>
-        <w:t xml:space="preserve">snake.py · dòng 279–381 — _selftest(), 9 nhóm kiểm tra tương ứng bảng dưới.</w:t>
+        <w:t xml:space="preserve">snake.py · dòng 303–433 — _selftest(), 9 nhóm kiểm tra tương ứng bảng dưới.</w:t>
       </w:r>
     </w:p>
     <w:tbl>
@@ -3829,7 +3829,7 @@
                 <w:sz w:val="22"/>
                 <w:szCs w:val="22"/>
               </w:rPr>
-              <w:t xml:space="preserve">Gọi draw() một khung hình</w:t>
+              <w:t xml:space="preserve">Vẽ khung, bấm R / nút chơi lại</w:t>
             </w:r>
           </w:p>
         </w:tc>
@@ -3861,7 +3861,7 @@
                 <w:sz w:val="22"/>
                 <w:szCs w:val="22"/>
               </w:rPr>
-              <w:t xml:space="preserve">Không lỗi</w:t>
+              <w:t xml:space="preserve">Vẽ không lỗi, chơi lại đúng, giữ kỷ lục</w:t>
             </w:r>
           </w:p>
         </w:tc>
@@ -3988,7 +3988,7 @@
           <w:sz w:val="24"/>
           <w:szCs w:val="24"/>
         </w:rPr>
-        <w:t xml:space="preserve">Điều khiển: mũi tên hoặc WASD để di chuyển, P tạm dừng, R chơi lại khi thua, Esc thoát.</w:t>
+        <w:t xml:space="preserve">Điều khiển: W A S D để di chuyển, P tạm dừng, R hoặc nút CHƠI LẠI để chơi lại, Esc thoát.</w:t>
       </w:r>
     </w:p>
     <w:p>

</xml_diff>